<commit_message>
Capitulo 6 updated with a new reference
</commit_message>
<xml_diff>
--- a/docs/Capítulo 6 - Bibliografía.docx
+++ b/docs/Capítulo 6 - Bibliografía.docx
@@ -257,7 +257,79 @@
           <w:sz w:val="24"/>
           <w:szCs w:val="24"/>
         </w:rPr>
-        <w:t>FEDIAF (European Pet Food Industry Federation)</w:t>
+        <w:t>FEDIAF (</w:t>
+      </w:r>
+      <w:proofErr w:type="spellStart"/>
+      <w:r>
+        <w:rPr>
+          <w:rFonts w:ascii="Times New Roman" w:eastAsia="Times New Roman" w:hAnsi="Times New Roman" w:cs="Times New Roman"/>
+          <w:sz w:val="24"/>
+          <w:szCs w:val="24"/>
+        </w:rPr>
+        <w:t>European</w:t>
+      </w:r>
+      <w:proofErr w:type="spellEnd"/>
+      <w:r>
+        <w:rPr>
+          <w:rFonts w:ascii="Times New Roman" w:eastAsia="Times New Roman" w:hAnsi="Times New Roman" w:cs="Times New Roman"/>
+          <w:sz w:val="24"/>
+          <w:szCs w:val="24"/>
+        </w:rPr>
+        <w:t xml:space="preserve"> Pet </w:t>
+      </w:r>
+      <w:proofErr w:type="spellStart"/>
+      <w:r>
+        <w:rPr>
+          <w:rFonts w:ascii="Times New Roman" w:eastAsia="Times New Roman" w:hAnsi="Times New Roman" w:cs="Times New Roman"/>
+          <w:sz w:val="24"/>
+          <w:szCs w:val="24"/>
+        </w:rPr>
+        <w:t>Food</w:t>
+      </w:r>
+      <w:proofErr w:type="spellEnd"/>
+      <w:r>
+        <w:rPr>
+          <w:rFonts w:ascii="Times New Roman" w:eastAsia="Times New Roman" w:hAnsi="Times New Roman" w:cs="Times New Roman"/>
+          <w:sz w:val="24"/>
+          <w:szCs w:val="24"/>
+        </w:rPr>
+        <w:t xml:space="preserve"> </w:t>
+      </w:r>
+      <w:proofErr w:type="spellStart"/>
+      <w:r>
+        <w:rPr>
+          <w:rFonts w:ascii="Times New Roman" w:eastAsia="Times New Roman" w:hAnsi="Times New Roman" w:cs="Times New Roman"/>
+          <w:sz w:val="24"/>
+          <w:szCs w:val="24"/>
+        </w:rPr>
+        <w:t>Industry</w:t>
+      </w:r>
+      <w:proofErr w:type="spellEnd"/>
+      <w:r>
+        <w:rPr>
+          <w:rFonts w:ascii="Times New Roman" w:eastAsia="Times New Roman" w:hAnsi="Times New Roman" w:cs="Times New Roman"/>
+          <w:sz w:val="24"/>
+          <w:szCs w:val="24"/>
+        </w:rPr>
+        <w:t xml:space="preserve"> </w:t>
+      </w:r>
+      <w:proofErr w:type="spellStart"/>
+      <w:r>
+        <w:rPr>
+          <w:rFonts w:ascii="Times New Roman" w:eastAsia="Times New Roman" w:hAnsi="Times New Roman" w:cs="Times New Roman"/>
+          <w:sz w:val="24"/>
+          <w:szCs w:val="24"/>
+        </w:rPr>
+        <w:t>Federation</w:t>
+      </w:r>
+      <w:proofErr w:type="spellEnd"/>
+      <w:r>
+        <w:rPr>
+          <w:rFonts w:ascii="Times New Roman" w:eastAsia="Times New Roman" w:hAnsi="Times New Roman" w:cs="Times New Roman"/>
+          <w:sz w:val="24"/>
+          <w:szCs w:val="24"/>
+        </w:rPr>
+        <w:t>)</w:t>
       </w:r>
       <w:r>
         <w:rPr>
@@ -318,7 +390,25 @@
           <w:sz w:val="24"/>
           <w:szCs w:val="24"/>
         </w:rPr>
-        <w:t>: Marzo de 2026</w:t>
+        <w:t xml:space="preserve">: </w:t>
+      </w:r>
+      <w:proofErr w:type="gramStart"/>
+      <w:r>
+        <w:rPr>
+          <w:rFonts w:ascii="Times New Roman" w:eastAsia="Times New Roman" w:hAnsi="Times New Roman" w:cs="Times New Roman"/>
+          <w:sz w:val="24"/>
+          <w:szCs w:val="24"/>
+        </w:rPr>
+        <w:t>Marzo</w:t>
+      </w:r>
+      <w:proofErr w:type="gramEnd"/>
+      <w:r>
+        <w:rPr>
+          <w:rFonts w:ascii="Times New Roman" w:eastAsia="Times New Roman" w:hAnsi="Times New Roman" w:cs="Times New Roman"/>
+          <w:sz w:val="24"/>
+          <w:szCs w:val="24"/>
+        </w:rPr>
+        <w:t xml:space="preserve"> de 2026</w:t>
       </w:r>
     </w:p>
     <w:p>
@@ -442,7 +532,25 @@
           <w:sz w:val="24"/>
           <w:szCs w:val="24"/>
         </w:rPr>
-        <w:t>: Marzo de 206</w:t>
+        <w:t xml:space="preserve">: </w:t>
+      </w:r>
+      <w:proofErr w:type="gramStart"/>
+      <w:r>
+        <w:rPr>
+          <w:rFonts w:ascii="Times New Roman" w:eastAsia="Times New Roman" w:hAnsi="Times New Roman" w:cs="Times New Roman"/>
+          <w:sz w:val="24"/>
+          <w:szCs w:val="24"/>
+        </w:rPr>
+        <w:t>Marzo</w:t>
+      </w:r>
+      <w:proofErr w:type="gramEnd"/>
+      <w:r>
+        <w:rPr>
+          <w:rFonts w:ascii="Times New Roman" w:eastAsia="Times New Roman" w:hAnsi="Times New Roman" w:cs="Times New Roman"/>
+          <w:sz w:val="24"/>
+          <w:szCs w:val="24"/>
+        </w:rPr>
+        <w:t xml:space="preserve"> de 206</w:t>
       </w:r>
     </w:p>
     <w:p>
@@ -477,23 +585,7 @@
           <w:sz w:val="24"/>
           <w:szCs w:val="24"/>
         </w:rPr>
-        <w:t>[</w:t>
-      </w:r>
-      <w:r>
-        <w:rPr>
-          <w:rFonts w:ascii="Times New Roman" w:eastAsia="Times New Roman" w:hAnsi="Times New Roman" w:cs="Times New Roman"/>
-          <w:sz w:val="24"/>
-          <w:szCs w:val="24"/>
-        </w:rPr>
-        <w:t>3</w:t>
-      </w:r>
-      <w:r>
-        <w:rPr>
-          <w:rFonts w:ascii="Times New Roman" w:eastAsia="Times New Roman" w:hAnsi="Times New Roman" w:cs="Times New Roman"/>
-          <w:sz w:val="24"/>
-          <w:szCs w:val="24"/>
-        </w:rPr>
-        <w:t>]</w:t>
+        <w:t>[3]</w:t>
       </w:r>
       <w:r>
         <w:rPr>
@@ -575,15 +667,25 @@
           <w:szCs w:val="24"/>
         </w:rPr>
         <w:lastRenderedPageBreak/>
-        <w:t>Fecha de consulta</w:t>
-      </w:r>
-      <w:r>
-        <w:rPr>
-          <w:rFonts w:ascii="Times New Roman" w:eastAsia="Times New Roman" w:hAnsi="Times New Roman" w:cs="Times New Roman"/>
-          <w:sz w:val="24"/>
-          <w:szCs w:val="24"/>
-        </w:rPr>
-        <w:t>: Marzo de 2026</w:t>
+        <w:t xml:space="preserve">Fecha de consulta: </w:t>
+      </w:r>
+      <w:proofErr w:type="gramStart"/>
+      <w:r>
+        <w:rPr>
+          <w:rFonts w:ascii="Times New Roman" w:eastAsia="Times New Roman" w:hAnsi="Times New Roman" w:cs="Times New Roman"/>
+          <w:sz w:val="24"/>
+          <w:szCs w:val="24"/>
+        </w:rPr>
+        <w:t>Marzo</w:t>
+      </w:r>
+      <w:proofErr w:type="gramEnd"/>
+      <w:r>
+        <w:rPr>
+          <w:rFonts w:ascii="Times New Roman" w:eastAsia="Times New Roman" w:hAnsi="Times New Roman" w:cs="Times New Roman"/>
+          <w:sz w:val="24"/>
+          <w:szCs w:val="24"/>
+        </w:rPr>
+        <w:t xml:space="preserve"> de 2026</w:t>
       </w:r>
     </w:p>
     <w:p>
@@ -612,23 +714,7 @@
           <w:sz w:val="24"/>
           <w:szCs w:val="24"/>
         </w:rPr>
-        <w:t>[</w:t>
-      </w:r>
-      <w:r>
-        <w:rPr>
-          <w:rFonts w:ascii="Times New Roman" w:eastAsia="Times New Roman" w:hAnsi="Times New Roman" w:cs="Times New Roman"/>
-          <w:sz w:val="24"/>
-          <w:szCs w:val="24"/>
-        </w:rPr>
-        <w:t>4</w:t>
-      </w:r>
-      <w:r>
-        <w:rPr>
-          <w:rFonts w:ascii="Times New Roman" w:eastAsia="Times New Roman" w:hAnsi="Times New Roman" w:cs="Times New Roman"/>
-          <w:sz w:val="24"/>
-          <w:szCs w:val="24"/>
-        </w:rPr>
-        <w:t>]</w:t>
+        <w:t>[4]</w:t>
       </w:r>
       <w:r>
         <w:rPr>
@@ -717,15 +803,25 @@
           <w:sz w:val="24"/>
           <w:szCs w:val="24"/>
         </w:rPr>
-        <w:t>Fecha de consulta</w:t>
-      </w:r>
-      <w:r>
-        <w:rPr>
-          <w:rFonts w:ascii="Times New Roman" w:eastAsia="Times New Roman" w:hAnsi="Times New Roman" w:cs="Times New Roman"/>
-          <w:sz w:val="24"/>
-          <w:szCs w:val="24"/>
-        </w:rPr>
-        <w:t>: Marzo de 2026</w:t>
+        <w:t xml:space="preserve">Fecha de consulta: </w:t>
+      </w:r>
+      <w:proofErr w:type="gramStart"/>
+      <w:r>
+        <w:rPr>
+          <w:rFonts w:ascii="Times New Roman" w:eastAsia="Times New Roman" w:hAnsi="Times New Roman" w:cs="Times New Roman"/>
+          <w:sz w:val="24"/>
+          <w:szCs w:val="24"/>
+        </w:rPr>
+        <w:t>Marzo</w:t>
+      </w:r>
+      <w:proofErr w:type="gramEnd"/>
+      <w:r>
+        <w:rPr>
+          <w:rFonts w:ascii="Times New Roman" w:eastAsia="Times New Roman" w:hAnsi="Times New Roman" w:cs="Times New Roman"/>
+          <w:sz w:val="24"/>
+          <w:szCs w:val="24"/>
+        </w:rPr>
+        <w:t xml:space="preserve"> de 2026</w:t>
       </w:r>
     </w:p>
     <w:p>
@@ -760,23 +856,7 @@
           <w:sz w:val="24"/>
           <w:szCs w:val="24"/>
         </w:rPr>
-        <w:t>[</w:t>
-      </w:r>
-      <w:r>
-        <w:rPr>
-          <w:rFonts w:ascii="Times New Roman" w:eastAsia="Times New Roman" w:hAnsi="Times New Roman" w:cs="Times New Roman"/>
-          <w:sz w:val="24"/>
-          <w:szCs w:val="24"/>
-        </w:rPr>
-        <w:t>5</w:t>
-      </w:r>
-      <w:r>
-        <w:rPr>
-          <w:rFonts w:ascii="Times New Roman" w:eastAsia="Times New Roman" w:hAnsi="Times New Roman" w:cs="Times New Roman"/>
-          <w:sz w:val="24"/>
-          <w:szCs w:val="24"/>
-        </w:rPr>
-        <w:t>]</w:t>
+        <w:t>[5]</w:t>
       </w:r>
       <w:r>
         <w:rPr>
@@ -856,7 +936,25 @@
           <w:sz w:val="24"/>
           <w:szCs w:val="24"/>
         </w:rPr>
-        <w:t>Fecha de consulta: Marzo de 2026</w:t>
+        <w:t xml:space="preserve">Fecha de consulta: </w:t>
+      </w:r>
+      <w:proofErr w:type="gramStart"/>
+      <w:r>
+        <w:rPr>
+          <w:rFonts w:ascii="Times New Roman" w:eastAsia="Times New Roman" w:hAnsi="Times New Roman" w:cs="Times New Roman"/>
+          <w:sz w:val="24"/>
+          <w:szCs w:val="24"/>
+        </w:rPr>
+        <w:t>Marzo</w:t>
+      </w:r>
+      <w:proofErr w:type="gramEnd"/>
+      <w:r>
+        <w:rPr>
+          <w:rFonts w:ascii="Times New Roman" w:eastAsia="Times New Roman" w:hAnsi="Times New Roman" w:cs="Times New Roman"/>
+          <w:sz w:val="24"/>
+          <w:szCs w:val="24"/>
+        </w:rPr>
+        <w:t xml:space="preserve"> de 2026</w:t>
       </w:r>
     </w:p>
     <w:p>
@@ -892,23 +990,7 @@
           <w:sz w:val="24"/>
           <w:szCs w:val="24"/>
         </w:rPr>
-        <w:t>[</w:t>
-      </w:r>
-      <w:r>
-        <w:rPr>
-          <w:rFonts w:ascii="Times New Roman" w:eastAsia="Times New Roman" w:hAnsi="Times New Roman" w:cs="Times New Roman"/>
-          <w:sz w:val="24"/>
-          <w:szCs w:val="24"/>
-        </w:rPr>
-        <w:t>6</w:t>
-      </w:r>
-      <w:r>
-        <w:rPr>
-          <w:rFonts w:ascii="Times New Roman" w:eastAsia="Times New Roman" w:hAnsi="Times New Roman" w:cs="Times New Roman"/>
-          <w:sz w:val="24"/>
-          <w:szCs w:val="24"/>
-        </w:rPr>
-        <w:t>]</w:t>
+        <w:t>[6]</w:t>
       </w:r>
       <w:r>
         <w:rPr>
@@ -1013,7 +1095,25 @@
           <w:sz w:val="24"/>
           <w:szCs w:val="24"/>
         </w:rPr>
-        <w:t>: Marzo de 2026</w:t>
+        <w:t xml:space="preserve">: </w:t>
+      </w:r>
+      <w:proofErr w:type="gramStart"/>
+      <w:r>
+        <w:rPr>
+          <w:rFonts w:ascii="Times New Roman" w:eastAsia="Times New Roman" w:hAnsi="Times New Roman" w:cs="Times New Roman"/>
+          <w:sz w:val="24"/>
+          <w:szCs w:val="24"/>
+        </w:rPr>
+        <w:t>Marzo</w:t>
+      </w:r>
+      <w:proofErr w:type="gramEnd"/>
+      <w:r>
+        <w:rPr>
+          <w:rFonts w:ascii="Times New Roman" w:eastAsia="Times New Roman" w:hAnsi="Times New Roman" w:cs="Times New Roman"/>
+          <w:sz w:val="24"/>
+          <w:szCs w:val="24"/>
+        </w:rPr>
+        <w:t xml:space="preserve"> de 2026</w:t>
       </w:r>
     </w:p>
     <w:p>
@@ -1048,23 +1148,7 @@
           <w:sz w:val="24"/>
           <w:szCs w:val="24"/>
         </w:rPr>
-        <w:t>[</w:t>
-      </w:r>
-      <w:r>
-        <w:rPr>
-          <w:rFonts w:ascii="Times New Roman" w:eastAsia="Times New Roman" w:hAnsi="Times New Roman" w:cs="Times New Roman"/>
-          <w:sz w:val="24"/>
-          <w:szCs w:val="24"/>
-        </w:rPr>
-        <w:t>7</w:t>
-      </w:r>
-      <w:r>
-        <w:rPr>
-          <w:rFonts w:ascii="Times New Roman" w:eastAsia="Times New Roman" w:hAnsi="Times New Roman" w:cs="Times New Roman"/>
-          <w:sz w:val="24"/>
-          <w:szCs w:val="24"/>
-        </w:rPr>
-        <w:t>]</w:t>
+        <w:t>[7]</w:t>
       </w:r>
       <w:r>
         <w:rPr>
@@ -1161,7 +1245,25 @@
           <w:sz w:val="24"/>
           <w:szCs w:val="24"/>
         </w:rPr>
-        <w:t>: Marzo de 2026</w:t>
+        <w:t xml:space="preserve">: </w:t>
+      </w:r>
+      <w:proofErr w:type="gramStart"/>
+      <w:r>
+        <w:rPr>
+          <w:rFonts w:ascii="Times New Roman" w:eastAsia="Times New Roman" w:hAnsi="Times New Roman" w:cs="Times New Roman"/>
+          <w:sz w:val="24"/>
+          <w:szCs w:val="24"/>
+        </w:rPr>
+        <w:t>Marzo</w:t>
+      </w:r>
+      <w:proofErr w:type="gramEnd"/>
+      <w:r>
+        <w:rPr>
+          <w:rFonts w:ascii="Times New Roman" w:eastAsia="Times New Roman" w:hAnsi="Times New Roman" w:cs="Times New Roman"/>
+          <w:sz w:val="24"/>
+          <w:szCs w:val="24"/>
+        </w:rPr>
+        <w:t xml:space="preserve"> de 2026</w:t>
       </w:r>
     </w:p>
     <w:p>
@@ -1196,23 +1298,7 @@
           <w:sz w:val="24"/>
           <w:szCs w:val="24"/>
         </w:rPr>
-        <w:t>[</w:t>
-      </w:r>
-      <w:r>
-        <w:rPr>
-          <w:rFonts w:ascii="Times New Roman" w:eastAsia="Times New Roman" w:hAnsi="Times New Roman" w:cs="Times New Roman"/>
-          <w:sz w:val="24"/>
-          <w:szCs w:val="24"/>
-        </w:rPr>
-        <w:t>8</w:t>
-      </w:r>
-      <w:r>
-        <w:rPr>
-          <w:rFonts w:ascii="Times New Roman" w:eastAsia="Times New Roman" w:hAnsi="Times New Roman" w:cs="Times New Roman"/>
-          <w:sz w:val="24"/>
-          <w:szCs w:val="24"/>
-        </w:rPr>
-        <w:t>]</w:t>
+        <w:t>[8]</w:t>
       </w:r>
       <w:r>
         <w:rPr>
@@ -1228,8 +1314,18 @@
           <w:sz w:val="24"/>
           <w:szCs w:val="24"/>
         </w:rPr>
-        <w:t>Spring Boot Reference Documentation</w:t>
-      </w:r>
+        <w:t xml:space="preserve">Spring Boot Reference </w:t>
+      </w:r>
+      <w:proofErr w:type="spellStart"/>
+      <w:r>
+        <w:rPr>
+          <w:rFonts w:ascii="Times New Roman" w:eastAsia="Times New Roman" w:hAnsi="Times New Roman" w:cs="Times New Roman"/>
+          <w:sz w:val="24"/>
+          <w:szCs w:val="24"/>
+        </w:rPr>
+        <w:t>Documentation</w:t>
+      </w:r>
+      <w:proofErr w:type="spellEnd"/>
     </w:p>
     <w:p>
       <w:pPr>
@@ -1309,7 +1405,25 @@
           <w:sz w:val="24"/>
           <w:szCs w:val="24"/>
         </w:rPr>
-        <w:t>: Marzo de 2026</w:t>
+        <w:t xml:space="preserve">: </w:t>
+      </w:r>
+      <w:proofErr w:type="gramStart"/>
+      <w:r>
+        <w:rPr>
+          <w:rFonts w:ascii="Times New Roman" w:eastAsia="Times New Roman" w:hAnsi="Times New Roman" w:cs="Times New Roman"/>
+          <w:sz w:val="24"/>
+          <w:szCs w:val="24"/>
+        </w:rPr>
+        <w:t>Marzo</w:t>
+      </w:r>
+      <w:proofErr w:type="gramEnd"/>
+      <w:r>
+        <w:rPr>
+          <w:rFonts w:ascii="Times New Roman" w:eastAsia="Times New Roman" w:hAnsi="Times New Roman" w:cs="Times New Roman"/>
+          <w:sz w:val="24"/>
+          <w:szCs w:val="24"/>
+        </w:rPr>
+        <w:t xml:space="preserve"> de 2026</w:t>
       </w:r>
     </w:p>
     <w:p>
@@ -1344,23 +1458,7 @@
           <w:sz w:val="24"/>
           <w:szCs w:val="24"/>
         </w:rPr>
-        <w:t>[</w:t>
-      </w:r>
-      <w:r>
-        <w:rPr>
-          <w:rFonts w:ascii="Times New Roman" w:eastAsia="Times New Roman" w:hAnsi="Times New Roman" w:cs="Times New Roman"/>
-          <w:sz w:val="24"/>
-          <w:szCs w:val="24"/>
-        </w:rPr>
-        <w:t>9</w:t>
-      </w:r>
-      <w:r>
-        <w:rPr>
-          <w:rFonts w:ascii="Times New Roman" w:eastAsia="Times New Roman" w:hAnsi="Times New Roman" w:cs="Times New Roman"/>
-          <w:sz w:val="24"/>
-          <w:szCs w:val="24"/>
-        </w:rPr>
-        <w:t>]</w:t>
+        <w:t>[9]</w:t>
       </w:r>
       <w:r>
         <w:rPr>
@@ -1376,8 +1474,18 @@
           <w:sz w:val="24"/>
           <w:szCs w:val="24"/>
         </w:rPr>
-        <w:t>Spring Security Reference Documentation</w:t>
-      </w:r>
+        <w:t xml:space="preserve">Spring Security Reference </w:t>
+      </w:r>
+      <w:proofErr w:type="spellStart"/>
+      <w:r>
+        <w:rPr>
+          <w:rFonts w:ascii="Times New Roman" w:eastAsia="Times New Roman" w:hAnsi="Times New Roman" w:cs="Times New Roman"/>
+          <w:sz w:val="24"/>
+          <w:szCs w:val="24"/>
+        </w:rPr>
+        <w:t>Documentation</w:t>
+      </w:r>
+      <w:proofErr w:type="spellEnd"/>
     </w:p>
     <w:p>
       <w:pPr>
@@ -1457,7 +1565,25 @@
           <w:sz w:val="24"/>
           <w:szCs w:val="24"/>
         </w:rPr>
-        <w:t>: Marzo de 2026</w:t>
+        <w:t xml:space="preserve">: </w:t>
+      </w:r>
+      <w:proofErr w:type="gramStart"/>
+      <w:r>
+        <w:rPr>
+          <w:rFonts w:ascii="Times New Roman" w:eastAsia="Times New Roman" w:hAnsi="Times New Roman" w:cs="Times New Roman"/>
+          <w:sz w:val="24"/>
+          <w:szCs w:val="24"/>
+        </w:rPr>
+        <w:t>Marzo</w:t>
+      </w:r>
+      <w:proofErr w:type="gramEnd"/>
+      <w:r>
+        <w:rPr>
+          <w:rFonts w:ascii="Times New Roman" w:eastAsia="Times New Roman" w:hAnsi="Times New Roman" w:cs="Times New Roman"/>
+          <w:sz w:val="24"/>
+          <w:szCs w:val="24"/>
+        </w:rPr>
+        <w:t xml:space="preserve"> de 2026</w:t>
       </w:r>
     </w:p>
     <w:p>
@@ -1492,23 +1618,7 @@
           <w:sz w:val="24"/>
           <w:szCs w:val="24"/>
         </w:rPr>
-        <w:t>[</w:t>
-      </w:r>
-      <w:r>
-        <w:rPr>
-          <w:rFonts w:ascii="Times New Roman" w:eastAsia="Times New Roman" w:hAnsi="Times New Roman" w:cs="Times New Roman"/>
-          <w:sz w:val="24"/>
-          <w:szCs w:val="24"/>
-        </w:rPr>
-        <w:t>10</w:t>
-      </w:r>
-      <w:r>
-        <w:rPr>
-          <w:rFonts w:ascii="Times New Roman" w:eastAsia="Times New Roman" w:hAnsi="Times New Roman" w:cs="Times New Roman"/>
-          <w:sz w:val="24"/>
-          <w:szCs w:val="24"/>
-        </w:rPr>
-        <w:t>]</w:t>
+        <w:t>[10]</w:t>
       </w:r>
       <w:r>
         <w:rPr>
@@ -1524,7 +1634,61 @@
           <w:sz w:val="24"/>
           <w:szCs w:val="24"/>
         </w:rPr>
-        <w:t>React — The library for web and native user interfaces</w:t>
+        <w:t xml:space="preserve">React — The </w:t>
+      </w:r>
+      <w:proofErr w:type="spellStart"/>
+      <w:r>
+        <w:rPr>
+          <w:rFonts w:ascii="Times New Roman" w:eastAsia="Times New Roman" w:hAnsi="Times New Roman" w:cs="Times New Roman"/>
+          <w:sz w:val="24"/>
+          <w:szCs w:val="24"/>
+        </w:rPr>
+        <w:t>library</w:t>
+      </w:r>
+      <w:proofErr w:type="spellEnd"/>
+      <w:r>
+        <w:rPr>
+          <w:rFonts w:ascii="Times New Roman" w:eastAsia="Times New Roman" w:hAnsi="Times New Roman" w:cs="Times New Roman"/>
+          <w:sz w:val="24"/>
+          <w:szCs w:val="24"/>
+        </w:rPr>
+        <w:t xml:space="preserve"> </w:t>
+      </w:r>
+      <w:proofErr w:type="spellStart"/>
+      <w:r>
+        <w:rPr>
+          <w:rFonts w:ascii="Times New Roman" w:eastAsia="Times New Roman" w:hAnsi="Times New Roman" w:cs="Times New Roman"/>
+          <w:sz w:val="24"/>
+          <w:szCs w:val="24"/>
+        </w:rPr>
+        <w:t>for</w:t>
+      </w:r>
+      <w:proofErr w:type="spellEnd"/>
+      <w:r>
+        <w:rPr>
+          <w:rFonts w:ascii="Times New Roman" w:eastAsia="Times New Roman" w:hAnsi="Times New Roman" w:cs="Times New Roman"/>
+          <w:sz w:val="24"/>
+          <w:szCs w:val="24"/>
+        </w:rPr>
+        <w:t xml:space="preserve"> web and native </w:t>
+      </w:r>
+      <w:proofErr w:type="spellStart"/>
+      <w:r>
+        <w:rPr>
+          <w:rFonts w:ascii="Times New Roman" w:eastAsia="Times New Roman" w:hAnsi="Times New Roman" w:cs="Times New Roman"/>
+          <w:sz w:val="24"/>
+          <w:szCs w:val="24"/>
+        </w:rPr>
+        <w:t>user</w:t>
+      </w:r>
+      <w:proofErr w:type="spellEnd"/>
+      <w:r>
+        <w:rPr>
+          <w:rFonts w:ascii="Times New Roman" w:eastAsia="Times New Roman" w:hAnsi="Times New Roman" w:cs="Times New Roman"/>
+          <w:sz w:val="24"/>
+          <w:szCs w:val="24"/>
+        </w:rPr>
+        <w:t xml:space="preserve"> interfaces</w:t>
       </w:r>
     </w:p>
     <w:p>
@@ -1543,7 +1707,25 @@
           <w:sz w:val="24"/>
           <w:szCs w:val="24"/>
         </w:rPr>
-        <w:t>Meta Platforms Inc.</w:t>
+        <w:t xml:space="preserve">Meta </w:t>
+      </w:r>
+      <w:proofErr w:type="spellStart"/>
+      <w:r>
+        <w:rPr>
+          <w:rFonts w:ascii="Times New Roman" w:eastAsia="Times New Roman" w:hAnsi="Times New Roman" w:cs="Times New Roman"/>
+          <w:sz w:val="24"/>
+          <w:szCs w:val="24"/>
+        </w:rPr>
+        <w:t>Platforms</w:t>
+      </w:r>
+      <w:proofErr w:type="spellEnd"/>
+      <w:r>
+        <w:rPr>
+          <w:rFonts w:ascii="Times New Roman" w:eastAsia="Times New Roman" w:hAnsi="Times New Roman" w:cs="Times New Roman"/>
+          <w:sz w:val="24"/>
+          <w:szCs w:val="24"/>
+        </w:rPr>
+        <w:t xml:space="preserve"> Inc.</w:t>
       </w:r>
       <w:r>
         <w:rPr>
@@ -1605,7 +1787,25 @@
           <w:sz w:val="24"/>
           <w:szCs w:val="24"/>
         </w:rPr>
-        <w:t>: Abril de 2026</w:t>
+        <w:t xml:space="preserve">: </w:t>
+      </w:r>
+      <w:proofErr w:type="gramStart"/>
+      <w:r>
+        <w:rPr>
+          <w:rFonts w:ascii="Times New Roman" w:eastAsia="Times New Roman" w:hAnsi="Times New Roman" w:cs="Times New Roman"/>
+          <w:sz w:val="24"/>
+          <w:szCs w:val="24"/>
+        </w:rPr>
+        <w:t>Abril</w:t>
+      </w:r>
+      <w:proofErr w:type="gramEnd"/>
+      <w:r>
+        <w:rPr>
+          <w:rFonts w:ascii="Times New Roman" w:eastAsia="Times New Roman" w:hAnsi="Times New Roman" w:cs="Times New Roman"/>
+          <w:sz w:val="24"/>
+          <w:szCs w:val="24"/>
+        </w:rPr>
+        <w:t xml:space="preserve"> de 2026</w:t>
       </w:r>
     </w:p>
     <w:p>
@@ -1640,23 +1840,7 @@
           <w:sz w:val="24"/>
           <w:szCs w:val="24"/>
         </w:rPr>
-        <w:t>[</w:t>
-      </w:r>
-      <w:r>
-        <w:rPr>
-          <w:rFonts w:ascii="Times New Roman" w:eastAsia="Times New Roman" w:hAnsi="Times New Roman" w:cs="Times New Roman"/>
-          <w:sz w:val="24"/>
-          <w:szCs w:val="24"/>
-        </w:rPr>
-        <w:t>11</w:t>
-      </w:r>
-      <w:r>
-        <w:rPr>
-          <w:rFonts w:ascii="Times New Roman" w:eastAsia="Times New Roman" w:hAnsi="Times New Roman" w:cs="Times New Roman"/>
-          <w:sz w:val="24"/>
-          <w:szCs w:val="24"/>
-        </w:rPr>
-        <w:t>]</w:t>
+        <w:t>[11]</w:t>
       </w:r>
       <w:r>
         <w:rPr>
@@ -1666,14 +1850,52 @@
         </w:rPr>
         <w:tab/>
       </w:r>
-      <w:r>
-        <w:rPr>
-          <w:rFonts w:ascii="Times New Roman" w:eastAsia="Times New Roman" w:hAnsi="Times New Roman" w:cs="Times New Roman"/>
-          <w:sz w:val="24"/>
-          <w:szCs w:val="24"/>
-        </w:rPr>
-        <w:t>Tailwind CSS — A utility-first CSS framework</w:t>
-      </w:r>
+      <w:proofErr w:type="spellStart"/>
+      <w:r>
+        <w:rPr>
+          <w:rFonts w:ascii="Times New Roman" w:eastAsia="Times New Roman" w:hAnsi="Times New Roman" w:cs="Times New Roman"/>
+          <w:sz w:val="24"/>
+          <w:szCs w:val="24"/>
+        </w:rPr>
+        <w:t>Tailwind</w:t>
+      </w:r>
+      <w:proofErr w:type="spellEnd"/>
+      <w:r>
+        <w:rPr>
+          <w:rFonts w:ascii="Times New Roman" w:eastAsia="Times New Roman" w:hAnsi="Times New Roman" w:cs="Times New Roman"/>
+          <w:sz w:val="24"/>
+          <w:szCs w:val="24"/>
+        </w:rPr>
+        <w:t xml:space="preserve"> CSS — A </w:t>
+      </w:r>
+      <w:proofErr w:type="spellStart"/>
+      <w:r>
+        <w:rPr>
+          <w:rFonts w:ascii="Times New Roman" w:eastAsia="Times New Roman" w:hAnsi="Times New Roman" w:cs="Times New Roman"/>
+          <w:sz w:val="24"/>
+          <w:szCs w:val="24"/>
+        </w:rPr>
+        <w:t>utility-first</w:t>
+      </w:r>
+      <w:proofErr w:type="spellEnd"/>
+      <w:r>
+        <w:rPr>
+          <w:rFonts w:ascii="Times New Roman" w:eastAsia="Times New Roman" w:hAnsi="Times New Roman" w:cs="Times New Roman"/>
+          <w:sz w:val="24"/>
+          <w:szCs w:val="24"/>
+        </w:rPr>
+        <w:t xml:space="preserve"> CSS </w:t>
+      </w:r>
+      <w:proofErr w:type="spellStart"/>
+      <w:r>
+        <w:rPr>
+          <w:rFonts w:ascii="Times New Roman" w:eastAsia="Times New Roman" w:hAnsi="Times New Roman" w:cs="Times New Roman"/>
+          <w:sz w:val="24"/>
+          <w:szCs w:val="24"/>
+        </w:rPr>
+        <w:t>framework</w:t>
+      </w:r>
+      <w:proofErr w:type="spellEnd"/>
     </w:p>
     <w:p>
       <w:pPr>
@@ -1685,13 +1907,23 @@
           <w:szCs w:val="24"/>
         </w:rPr>
       </w:pPr>
-      <w:r>
-        <w:rPr>
-          <w:rFonts w:ascii="Times New Roman" w:eastAsia="Times New Roman" w:hAnsi="Times New Roman" w:cs="Times New Roman"/>
-          <w:sz w:val="24"/>
-          <w:szCs w:val="24"/>
-        </w:rPr>
-        <w:t>Tailwind Labs Inc.</w:t>
+      <w:proofErr w:type="spellStart"/>
+      <w:r>
+        <w:rPr>
+          <w:rFonts w:ascii="Times New Roman" w:eastAsia="Times New Roman" w:hAnsi="Times New Roman" w:cs="Times New Roman"/>
+          <w:sz w:val="24"/>
+          <w:szCs w:val="24"/>
+        </w:rPr>
+        <w:t>Tailwind</w:t>
+      </w:r>
+      <w:proofErr w:type="spellEnd"/>
+      <w:r>
+        <w:rPr>
+          <w:rFonts w:ascii="Times New Roman" w:eastAsia="Times New Roman" w:hAnsi="Times New Roman" w:cs="Times New Roman"/>
+          <w:sz w:val="24"/>
+          <w:szCs w:val="24"/>
+        </w:rPr>
+        <w:t xml:space="preserve"> Labs Inc.</w:t>
       </w:r>
       <w:r>
         <w:rPr>
@@ -1753,7 +1985,25 @@
           <w:sz w:val="24"/>
           <w:szCs w:val="24"/>
         </w:rPr>
-        <w:t>: Abril de 2026</w:t>
+        <w:t xml:space="preserve">: </w:t>
+      </w:r>
+      <w:proofErr w:type="gramStart"/>
+      <w:r>
+        <w:rPr>
+          <w:rFonts w:ascii="Times New Roman" w:eastAsia="Times New Roman" w:hAnsi="Times New Roman" w:cs="Times New Roman"/>
+          <w:sz w:val="24"/>
+          <w:szCs w:val="24"/>
+        </w:rPr>
+        <w:t>Abril</w:t>
+      </w:r>
+      <w:proofErr w:type="gramEnd"/>
+      <w:r>
+        <w:rPr>
+          <w:rFonts w:ascii="Times New Roman" w:eastAsia="Times New Roman" w:hAnsi="Times New Roman" w:cs="Times New Roman"/>
+          <w:sz w:val="24"/>
+          <w:szCs w:val="24"/>
+        </w:rPr>
+        <w:t xml:space="preserve"> de 2026</w:t>
       </w:r>
     </w:p>
     <w:p>
@@ -1782,23 +2032,7 @@
           <w:sz w:val="24"/>
           <w:szCs w:val="24"/>
         </w:rPr>
-        <w:t>[</w:t>
-      </w:r>
-      <w:r>
-        <w:rPr>
-          <w:rFonts w:ascii="Times New Roman" w:eastAsia="Times New Roman" w:hAnsi="Times New Roman" w:cs="Times New Roman"/>
-          <w:sz w:val="24"/>
-          <w:szCs w:val="24"/>
-        </w:rPr>
-        <w:t>1</w:t>
-      </w:r>
-      <w:r>
-        <w:rPr>
-          <w:rFonts w:ascii="Times New Roman" w:eastAsia="Times New Roman" w:hAnsi="Times New Roman" w:cs="Times New Roman"/>
-          <w:sz w:val="24"/>
-          <w:szCs w:val="24"/>
-        </w:rPr>
-        <w:t>2]</w:t>
+        <w:t>[12]</w:t>
       </w:r>
       <w:r>
         <w:rPr>
@@ -1814,8 +2048,36 @@
           <w:sz w:val="24"/>
           <w:szCs w:val="24"/>
         </w:rPr>
-        <w:t>Vite — Next Generation Frontend Tooling</w:t>
-      </w:r>
+        <w:t xml:space="preserve">Vite — Next </w:t>
+      </w:r>
+      <w:proofErr w:type="spellStart"/>
+      <w:r>
+        <w:rPr>
+          <w:rFonts w:ascii="Times New Roman" w:eastAsia="Times New Roman" w:hAnsi="Times New Roman" w:cs="Times New Roman"/>
+          <w:sz w:val="24"/>
+          <w:szCs w:val="24"/>
+        </w:rPr>
+        <w:t>Generation</w:t>
+      </w:r>
+      <w:proofErr w:type="spellEnd"/>
+      <w:r>
+        <w:rPr>
+          <w:rFonts w:ascii="Times New Roman" w:eastAsia="Times New Roman" w:hAnsi="Times New Roman" w:cs="Times New Roman"/>
+          <w:sz w:val="24"/>
+          <w:szCs w:val="24"/>
+        </w:rPr>
+        <w:t xml:space="preserve"> Frontend </w:t>
+      </w:r>
+      <w:proofErr w:type="spellStart"/>
+      <w:r>
+        <w:rPr>
+          <w:rFonts w:ascii="Times New Roman" w:eastAsia="Times New Roman" w:hAnsi="Times New Roman" w:cs="Times New Roman"/>
+          <w:sz w:val="24"/>
+          <w:szCs w:val="24"/>
+        </w:rPr>
+        <w:t>Tooling</w:t>
+      </w:r>
+      <w:proofErr w:type="spellEnd"/>
     </w:p>
     <w:p>
       <w:pPr>
@@ -1895,7 +2157,25 @@
           <w:sz w:val="24"/>
           <w:szCs w:val="24"/>
         </w:rPr>
-        <w:t>: Abril de 2026</w:t>
+        <w:t xml:space="preserve">: </w:t>
+      </w:r>
+      <w:proofErr w:type="gramStart"/>
+      <w:r>
+        <w:rPr>
+          <w:rFonts w:ascii="Times New Roman" w:eastAsia="Times New Roman" w:hAnsi="Times New Roman" w:cs="Times New Roman"/>
+          <w:sz w:val="24"/>
+          <w:szCs w:val="24"/>
+        </w:rPr>
+        <w:t>Abril</w:t>
+      </w:r>
+      <w:proofErr w:type="gramEnd"/>
+      <w:r>
+        <w:rPr>
+          <w:rFonts w:ascii="Times New Roman" w:eastAsia="Times New Roman" w:hAnsi="Times New Roman" w:cs="Times New Roman"/>
+          <w:sz w:val="24"/>
+          <w:szCs w:val="24"/>
+        </w:rPr>
+        <w:t xml:space="preserve"> de 2026</w:t>
       </w:r>
     </w:p>
     <w:p>
@@ -1930,23 +2210,7 @@
           <w:sz w:val="24"/>
           <w:szCs w:val="24"/>
         </w:rPr>
-        <w:t>[</w:t>
-      </w:r>
-      <w:r>
-        <w:rPr>
-          <w:rFonts w:ascii="Times New Roman" w:eastAsia="Times New Roman" w:hAnsi="Times New Roman" w:cs="Times New Roman"/>
-          <w:sz w:val="24"/>
-          <w:szCs w:val="24"/>
-        </w:rPr>
-        <w:t>13</w:t>
-      </w:r>
-      <w:r>
-        <w:rPr>
-          <w:rFonts w:ascii="Times New Roman" w:eastAsia="Times New Roman" w:hAnsi="Times New Roman" w:cs="Times New Roman"/>
-          <w:sz w:val="24"/>
-          <w:szCs w:val="24"/>
-        </w:rPr>
-        <w:t>]</w:t>
+        <w:t>[13]</w:t>
       </w:r>
       <w:r>
         <w:rPr>
@@ -1962,7 +2226,79 @@
           <w:sz w:val="24"/>
           <w:szCs w:val="24"/>
         </w:rPr>
-        <w:t>Axios — Promise based HTTP client for the browser and Node.js</w:t>
+        <w:t xml:space="preserve">Axios — Promise </w:t>
+      </w:r>
+      <w:proofErr w:type="spellStart"/>
+      <w:r>
+        <w:rPr>
+          <w:rFonts w:ascii="Times New Roman" w:eastAsia="Times New Roman" w:hAnsi="Times New Roman" w:cs="Times New Roman"/>
+          <w:sz w:val="24"/>
+          <w:szCs w:val="24"/>
+        </w:rPr>
+        <w:t>based</w:t>
+      </w:r>
+      <w:proofErr w:type="spellEnd"/>
+      <w:r>
+        <w:rPr>
+          <w:rFonts w:ascii="Times New Roman" w:eastAsia="Times New Roman" w:hAnsi="Times New Roman" w:cs="Times New Roman"/>
+          <w:sz w:val="24"/>
+          <w:szCs w:val="24"/>
+        </w:rPr>
+        <w:t xml:space="preserve"> HTTP </w:t>
+      </w:r>
+      <w:proofErr w:type="spellStart"/>
+      <w:r>
+        <w:rPr>
+          <w:rFonts w:ascii="Times New Roman" w:eastAsia="Times New Roman" w:hAnsi="Times New Roman" w:cs="Times New Roman"/>
+          <w:sz w:val="24"/>
+          <w:szCs w:val="24"/>
+        </w:rPr>
+        <w:t>client</w:t>
+      </w:r>
+      <w:proofErr w:type="spellEnd"/>
+      <w:r>
+        <w:rPr>
+          <w:rFonts w:ascii="Times New Roman" w:eastAsia="Times New Roman" w:hAnsi="Times New Roman" w:cs="Times New Roman"/>
+          <w:sz w:val="24"/>
+          <w:szCs w:val="24"/>
+        </w:rPr>
+        <w:t xml:space="preserve"> </w:t>
+      </w:r>
+      <w:proofErr w:type="spellStart"/>
+      <w:r>
+        <w:rPr>
+          <w:rFonts w:ascii="Times New Roman" w:eastAsia="Times New Roman" w:hAnsi="Times New Roman" w:cs="Times New Roman"/>
+          <w:sz w:val="24"/>
+          <w:szCs w:val="24"/>
+        </w:rPr>
+        <w:t>for</w:t>
+      </w:r>
+      <w:proofErr w:type="spellEnd"/>
+      <w:r>
+        <w:rPr>
+          <w:rFonts w:ascii="Times New Roman" w:eastAsia="Times New Roman" w:hAnsi="Times New Roman" w:cs="Times New Roman"/>
+          <w:sz w:val="24"/>
+          <w:szCs w:val="24"/>
+        </w:rPr>
+        <w:t xml:space="preserve"> </w:t>
+      </w:r>
+      <w:proofErr w:type="spellStart"/>
+      <w:r>
+        <w:rPr>
+          <w:rFonts w:ascii="Times New Roman" w:eastAsia="Times New Roman" w:hAnsi="Times New Roman" w:cs="Times New Roman"/>
+          <w:sz w:val="24"/>
+          <w:szCs w:val="24"/>
+        </w:rPr>
+        <w:t>the</w:t>
+      </w:r>
+      <w:proofErr w:type="spellEnd"/>
+      <w:r>
+        <w:rPr>
+          <w:rFonts w:ascii="Times New Roman" w:eastAsia="Times New Roman" w:hAnsi="Times New Roman" w:cs="Times New Roman"/>
+          <w:sz w:val="24"/>
+          <w:szCs w:val="24"/>
+        </w:rPr>
+        <w:t xml:space="preserve"> browser and Node.js</w:t>
       </w:r>
     </w:p>
     <w:p>
@@ -2043,7 +2379,25 @@
           <w:sz w:val="24"/>
           <w:szCs w:val="24"/>
         </w:rPr>
-        <w:t>: Abril de 2026</w:t>
+        <w:t xml:space="preserve">: </w:t>
+      </w:r>
+      <w:proofErr w:type="gramStart"/>
+      <w:r>
+        <w:rPr>
+          <w:rFonts w:ascii="Times New Roman" w:eastAsia="Times New Roman" w:hAnsi="Times New Roman" w:cs="Times New Roman"/>
+          <w:sz w:val="24"/>
+          <w:szCs w:val="24"/>
+        </w:rPr>
+        <w:t>Abril</w:t>
+      </w:r>
+      <w:proofErr w:type="gramEnd"/>
+      <w:r>
+        <w:rPr>
+          <w:rFonts w:ascii="Times New Roman" w:eastAsia="Times New Roman" w:hAnsi="Times New Roman" w:cs="Times New Roman"/>
+          <w:sz w:val="24"/>
+          <w:szCs w:val="24"/>
+        </w:rPr>
+        <w:t xml:space="preserve"> de 2026</w:t>
       </w:r>
     </w:p>
     <w:p>
@@ -2078,23 +2432,7 @@
           <w:sz w:val="24"/>
           <w:szCs w:val="24"/>
         </w:rPr>
-        <w:t>[</w:t>
-      </w:r>
-      <w:r>
-        <w:rPr>
-          <w:rFonts w:ascii="Times New Roman" w:eastAsia="Times New Roman" w:hAnsi="Times New Roman" w:cs="Times New Roman"/>
-          <w:sz w:val="24"/>
-          <w:szCs w:val="24"/>
-        </w:rPr>
-        <w:t>14</w:t>
-      </w:r>
-      <w:r>
-        <w:rPr>
-          <w:rFonts w:ascii="Times New Roman" w:eastAsia="Times New Roman" w:hAnsi="Times New Roman" w:cs="Times New Roman"/>
-          <w:sz w:val="24"/>
-          <w:szCs w:val="24"/>
-        </w:rPr>
-        <w:t>]</w:t>
+        <w:t>[14]</w:t>
       </w:r>
       <w:r>
         <w:rPr>
@@ -2129,8 +2467,18 @@
           <w:sz w:val="24"/>
           <w:szCs w:val="24"/>
         </w:rPr>
-        <w:t>Oracle Corporation</w:t>
-      </w:r>
+        <w:t xml:space="preserve">Oracle </w:t>
+      </w:r>
+      <w:proofErr w:type="spellStart"/>
+      <w:r>
+        <w:rPr>
+          <w:rFonts w:ascii="Times New Roman" w:eastAsia="Times New Roman" w:hAnsi="Times New Roman" w:cs="Times New Roman"/>
+          <w:sz w:val="24"/>
+          <w:szCs w:val="24"/>
+        </w:rPr>
+        <w:t>Corporation</w:t>
+      </w:r>
+      <w:proofErr w:type="spellEnd"/>
       <w:r>
         <w:rPr>
           <w:rFonts w:ascii="Times New Roman" w:eastAsia="Times New Roman" w:hAnsi="Times New Roman" w:cs="Times New Roman"/>
@@ -2191,7 +2539,25 @@
           <w:sz w:val="24"/>
           <w:szCs w:val="24"/>
         </w:rPr>
-        <w:t>: Marzo de 2026</w:t>
+        <w:t xml:space="preserve">: </w:t>
+      </w:r>
+      <w:proofErr w:type="gramStart"/>
+      <w:r>
+        <w:rPr>
+          <w:rFonts w:ascii="Times New Roman" w:eastAsia="Times New Roman" w:hAnsi="Times New Roman" w:cs="Times New Roman"/>
+          <w:sz w:val="24"/>
+          <w:szCs w:val="24"/>
+        </w:rPr>
+        <w:t>Marzo</w:t>
+      </w:r>
+      <w:proofErr w:type="gramEnd"/>
+      <w:r>
+        <w:rPr>
+          <w:rFonts w:ascii="Times New Roman" w:eastAsia="Times New Roman" w:hAnsi="Times New Roman" w:cs="Times New Roman"/>
+          <w:sz w:val="24"/>
+          <w:szCs w:val="24"/>
+        </w:rPr>
+        <w:t xml:space="preserve"> de 2026</w:t>
       </w:r>
     </w:p>
     <w:p>
@@ -2226,23 +2592,7 @@
           <w:sz w:val="24"/>
           <w:szCs w:val="24"/>
         </w:rPr>
-        <w:t>[</w:t>
-      </w:r>
-      <w:r>
-        <w:rPr>
-          <w:rFonts w:ascii="Times New Roman" w:eastAsia="Times New Roman" w:hAnsi="Times New Roman" w:cs="Times New Roman"/>
-          <w:sz w:val="24"/>
-          <w:szCs w:val="24"/>
-        </w:rPr>
-        <w:t>15</w:t>
-      </w:r>
-      <w:r>
-        <w:rPr>
-          <w:rFonts w:ascii="Times New Roman" w:eastAsia="Times New Roman" w:hAnsi="Times New Roman" w:cs="Times New Roman"/>
-          <w:sz w:val="24"/>
-          <w:szCs w:val="24"/>
-        </w:rPr>
-        <w:t>]</w:t>
+        <w:t>[15]</w:t>
       </w:r>
       <w:r>
         <w:rPr>
@@ -2277,8 +2627,18 @@
           <w:sz w:val="24"/>
           <w:szCs w:val="24"/>
         </w:rPr>
-        <w:t>M. Jones, J. Bradley, N. Sakimura</w:t>
-      </w:r>
+        <w:t xml:space="preserve">M. Jones, J. Bradley, N. </w:t>
+      </w:r>
+      <w:proofErr w:type="spellStart"/>
+      <w:r>
+        <w:rPr>
+          <w:rFonts w:ascii="Times New Roman" w:eastAsia="Times New Roman" w:hAnsi="Times New Roman" w:cs="Times New Roman"/>
+          <w:sz w:val="24"/>
+          <w:szCs w:val="24"/>
+        </w:rPr>
+        <w:t>Sakimura</w:t>
+      </w:r>
+      <w:proofErr w:type="spellEnd"/>
       <w:r>
         <w:rPr>
           <w:rFonts w:ascii="Times New Roman" w:eastAsia="Times New Roman" w:hAnsi="Times New Roman" w:cs="Times New Roman"/>
@@ -2339,7 +2699,25 @@
           <w:sz w:val="24"/>
           <w:szCs w:val="24"/>
         </w:rPr>
-        <w:t>: Marzo de 2026</w:t>
+        <w:t xml:space="preserve">: </w:t>
+      </w:r>
+      <w:proofErr w:type="gramStart"/>
+      <w:r>
+        <w:rPr>
+          <w:rFonts w:ascii="Times New Roman" w:eastAsia="Times New Roman" w:hAnsi="Times New Roman" w:cs="Times New Roman"/>
+          <w:sz w:val="24"/>
+          <w:szCs w:val="24"/>
+        </w:rPr>
+        <w:t>Marzo</w:t>
+      </w:r>
+      <w:proofErr w:type="gramEnd"/>
+      <w:r>
+        <w:rPr>
+          <w:rFonts w:ascii="Times New Roman" w:eastAsia="Times New Roman" w:hAnsi="Times New Roman" w:cs="Times New Roman"/>
+          <w:sz w:val="24"/>
+          <w:szCs w:val="24"/>
+        </w:rPr>
+        <w:t xml:space="preserve"> de 2026</w:t>
       </w:r>
     </w:p>
     <w:p>
@@ -2374,23 +2752,7 @@
           <w:sz w:val="24"/>
           <w:szCs w:val="24"/>
         </w:rPr>
-        <w:t>[</w:t>
-      </w:r>
-      <w:r>
-        <w:rPr>
-          <w:rFonts w:ascii="Times New Roman" w:eastAsia="Times New Roman" w:hAnsi="Times New Roman" w:cs="Times New Roman"/>
-          <w:sz w:val="24"/>
-          <w:szCs w:val="24"/>
-        </w:rPr>
-        <w:t>16</w:t>
-      </w:r>
-      <w:r>
-        <w:rPr>
-          <w:rFonts w:ascii="Times New Roman" w:eastAsia="Times New Roman" w:hAnsi="Times New Roman" w:cs="Times New Roman"/>
-          <w:sz w:val="24"/>
-          <w:szCs w:val="24"/>
-        </w:rPr>
-        <w:t>]</w:t>
+        <w:t>[16]</w:t>
       </w:r>
       <w:r>
         <w:rPr>
@@ -2400,13 +2762,59 @@
         </w:rPr>
         <w:tab/>
       </w:r>
-      <w:r>
-        <w:rPr>
-          <w:rFonts w:ascii="Times New Roman" w:eastAsia="Times New Roman" w:hAnsi="Times New Roman" w:cs="Times New Roman"/>
-          <w:sz w:val="24"/>
-          <w:szCs w:val="24"/>
-        </w:rPr>
-        <w:t>Password Storage — OWASP Cheat Sheet Series</w:t>
+      <w:proofErr w:type="spellStart"/>
+      <w:r>
+        <w:rPr>
+          <w:rFonts w:ascii="Times New Roman" w:eastAsia="Times New Roman" w:hAnsi="Times New Roman" w:cs="Times New Roman"/>
+          <w:sz w:val="24"/>
+          <w:szCs w:val="24"/>
+        </w:rPr>
+        <w:t>Password</w:t>
+      </w:r>
+      <w:proofErr w:type="spellEnd"/>
+      <w:r>
+        <w:rPr>
+          <w:rFonts w:ascii="Times New Roman" w:eastAsia="Times New Roman" w:hAnsi="Times New Roman" w:cs="Times New Roman"/>
+          <w:sz w:val="24"/>
+          <w:szCs w:val="24"/>
+        </w:rPr>
+        <w:t xml:space="preserve"> Storage — OWASP </w:t>
+      </w:r>
+      <w:proofErr w:type="spellStart"/>
+      <w:r>
+        <w:rPr>
+          <w:rFonts w:ascii="Times New Roman" w:eastAsia="Times New Roman" w:hAnsi="Times New Roman" w:cs="Times New Roman"/>
+          <w:sz w:val="24"/>
+          <w:szCs w:val="24"/>
+        </w:rPr>
+        <w:t>Cheat</w:t>
+      </w:r>
+      <w:proofErr w:type="spellEnd"/>
+      <w:r>
+        <w:rPr>
+          <w:rFonts w:ascii="Times New Roman" w:eastAsia="Times New Roman" w:hAnsi="Times New Roman" w:cs="Times New Roman"/>
+          <w:sz w:val="24"/>
+          <w:szCs w:val="24"/>
+        </w:rPr>
+        <w:t xml:space="preserve"> </w:t>
+      </w:r>
+      <w:proofErr w:type="spellStart"/>
+      <w:r>
+        <w:rPr>
+          <w:rFonts w:ascii="Times New Roman" w:eastAsia="Times New Roman" w:hAnsi="Times New Roman" w:cs="Times New Roman"/>
+          <w:sz w:val="24"/>
+          <w:szCs w:val="24"/>
+        </w:rPr>
+        <w:t>Sheet</w:t>
+      </w:r>
+      <w:proofErr w:type="spellEnd"/>
+      <w:r>
+        <w:rPr>
+          <w:rFonts w:ascii="Times New Roman" w:eastAsia="Times New Roman" w:hAnsi="Times New Roman" w:cs="Times New Roman"/>
+          <w:sz w:val="24"/>
+          <w:szCs w:val="24"/>
+        </w:rPr>
+        <w:t xml:space="preserve"> Series</w:t>
       </w:r>
     </w:p>
     <w:p>
@@ -2425,8 +2833,18 @@
           <w:sz w:val="24"/>
           <w:szCs w:val="24"/>
         </w:rPr>
-        <w:t>OWASP Foundation</w:t>
-      </w:r>
+        <w:t xml:space="preserve">OWASP </w:t>
+      </w:r>
+      <w:proofErr w:type="spellStart"/>
+      <w:r>
+        <w:rPr>
+          <w:rFonts w:ascii="Times New Roman" w:eastAsia="Times New Roman" w:hAnsi="Times New Roman" w:cs="Times New Roman"/>
+          <w:sz w:val="24"/>
+          <w:szCs w:val="24"/>
+        </w:rPr>
+        <w:t>Foundation</w:t>
+      </w:r>
+      <w:proofErr w:type="spellEnd"/>
       <w:r>
         <w:rPr>
           <w:rFonts w:ascii="Times New Roman" w:eastAsia="Times New Roman" w:hAnsi="Times New Roman" w:cs="Times New Roman"/>
@@ -2487,7 +2905,25 @@
           <w:sz w:val="24"/>
           <w:szCs w:val="24"/>
         </w:rPr>
-        <w:t>: Marzo de 2026</w:t>
+        <w:t xml:space="preserve">: </w:t>
+      </w:r>
+      <w:proofErr w:type="gramStart"/>
+      <w:r>
+        <w:rPr>
+          <w:rFonts w:ascii="Times New Roman" w:eastAsia="Times New Roman" w:hAnsi="Times New Roman" w:cs="Times New Roman"/>
+          <w:sz w:val="24"/>
+          <w:szCs w:val="24"/>
+        </w:rPr>
+        <w:t>Marzo</w:t>
+      </w:r>
+      <w:proofErr w:type="gramEnd"/>
+      <w:r>
+        <w:rPr>
+          <w:rFonts w:ascii="Times New Roman" w:eastAsia="Times New Roman" w:hAnsi="Times New Roman" w:cs="Times New Roman"/>
+          <w:sz w:val="24"/>
+          <w:szCs w:val="24"/>
+        </w:rPr>
+        <w:t xml:space="preserve"> de 2026</w:t>
       </w:r>
     </w:p>
     <w:p>
@@ -2522,23 +2958,7 @@
           <w:sz w:val="24"/>
           <w:szCs w:val="24"/>
         </w:rPr>
-        <w:t>[</w:t>
-      </w:r>
-      <w:r>
-        <w:rPr>
-          <w:rFonts w:ascii="Times New Roman" w:eastAsia="Times New Roman" w:hAnsi="Times New Roman" w:cs="Times New Roman"/>
-          <w:sz w:val="24"/>
-          <w:szCs w:val="24"/>
-        </w:rPr>
-        <w:t>17</w:t>
-      </w:r>
-      <w:r>
-        <w:rPr>
-          <w:rFonts w:ascii="Times New Roman" w:eastAsia="Times New Roman" w:hAnsi="Times New Roman" w:cs="Times New Roman"/>
-          <w:sz w:val="24"/>
-          <w:szCs w:val="24"/>
-        </w:rPr>
-        <w:t>]</w:t>
+        <w:t>[17]</w:t>
       </w:r>
       <w:r>
         <w:rPr>
@@ -2548,14 +2968,34 @@
         </w:rPr>
         <w:tab/>
       </w:r>
-      <w:r>
-        <w:rPr>
-          <w:rFonts w:ascii="Times New Roman" w:eastAsia="Times New Roman" w:hAnsi="Times New Roman" w:cs="Times New Roman"/>
-          <w:sz w:val="24"/>
-          <w:szCs w:val="24"/>
-        </w:rPr>
-        <w:t>Hibernate ORM Documentation</w:t>
-      </w:r>
+      <w:proofErr w:type="spellStart"/>
+      <w:r>
+        <w:rPr>
+          <w:rFonts w:ascii="Times New Roman" w:eastAsia="Times New Roman" w:hAnsi="Times New Roman" w:cs="Times New Roman"/>
+          <w:sz w:val="24"/>
+          <w:szCs w:val="24"/>
+        </w:rPr>
+        <w:t>Hibernate</w:t>
+      </w:r>
+      <w:proofErr w:type="spellEnd"/>
+      <w:r>
+        <w:rPr>
+          <w:rFonts w:ascii="Times New Roman" w:eastAsia="Times New Roman" w:hAnsi="Times New Roman" w:cs="Times New Roman"/>
+          <w:sz w:val="24"/>
+          <w:szCs w:val="24"/>
+        </w:rPr>
+        <w:t xml:space="preserve"> ORM </w:t>
+      </w:r>
+      <w:proofErr w:type="spellStart"/>
+      <w:r>
+        <w:rPr>
+          <w:rFonts w:ascii="Times New Roman" w:eastAsia="Times New Roman" w:hAnsi="Times New Roman" w:cs="Times New Roman"/>
+          <w:sz w:val="24"/>
+          <w:szCs w:val="24"/>
+        </w:rPr>
+        <w:t>Documentation</w:t>
+      </w:r>
+      <w:proofErr w:type="spellEnd"/>
     </w:p>
     <w:p>
       <w:pPr>
@@ -2573,7 +3013,25 @@
           <w:sz w:val="24"/>
           <w:szCs w:val="24"/>
         </w:rPr>
-        <w:t>Red Hat Inc.</w:t>
+        <w:t xml:space="preserve">Red </w:t>
+      </w:r>
+      <w:proofErr w:type="spellStart"/>
+      <w:r>
+        <w:rPr>
+          <w:rFonts w:ascii="Times New Roman" w:eastAsia="Times New Roman" w:hAnsi="Times New Roman" w:cs="Times New Roman"/>
+          <w:sz w:val="24"/>
+          <w:szCs w:val="24"/>
+        </w:rPr>
+        <w:t>Hat</w:t>
+      </w:r>
+      <w:proofErr w:type="spellEnd"/>
+      <w:r>
+        <w:rPr>
+          <w:rFonts w:ascii="Times New Roman" w:eastAsia="Times New Roman" w:hAnsi="Times New Roman" w:cs="Times New Roman"/>
+          <w:sz w:val="24"/>
+          <w:szCs w:val="24"/>
+        </w:rPr>
+        <w:t xml:space="preserve"> Inc.</w:t>
       </w:r>
       <w:r>
         <w:rPr>
@@ -2635,7 +3093,25 @@
           <w:sz w:val="24"/>
           <w:szCs w:val="24"/>
         </w:rPr>
-        <w:t>: Marzo de 2026</w:t>
+        <w:t xml:space="preserve">: </w:t>
+      </w:r>
+      <w:proofErr w:type="gramStart"/>
+      <w:r>
+        <w:rPr>
+          <w:rFonts w:ascii="Times New Roman" w:eastAsia="Times New Roman" w:hAnsi="Times New Roman" w:cs="Times New Roman"/>
+          <w:sz w:val="24"/>
+          <w:szCs w:val="24"/>
+        </w:rPr>
+        <w:t>Marzo</w:t>
+      </w:r>
+      <w:proofErr w:type="gramEnd"/>
+      <w:r>
+        <w:rPr>
+          <w:rFonts w:ascii="Times New Roman" w:eastAsia="Times New Roman" w:hAnsi="Times New Roman" w:cs="Times New Roman"/>
+          <w:sz w:val="24"/>
+          <w:szCs w:val="24"/>
+        </w:rPr>
+        <w:t xml:space="preserve"> de 2026</w:t>
       </w:r>
     </w:p>
     <w:p>
@@ -2670,23 +3146,7 @@
           <w:sz w:val="24"/>
           <w:szCs w:val="24"/>
         </w:rPr>
-        <w:t>[</w:t>
-      </w:r>
-      <w:r>
-        <w:rPr>
-          <w:rFonts w:ascii="Times New Roman" w:eastAsia="Times New Roman" w:hAnsi="Times New Roman" w:cs="Times New Roman"/>
-          <w:sz w:val="24"/>
-          <w:szCs w:val="24"/>
-        </w:rPr>
-        <w:t>18</w:t>
-      </w:r>
-      <w:r>
-        <w:rPr>
-          <w:rFonts w:ascii="Times New Roman" w:eastAsia="Times New Roman" w:hAnsi="Times New Roman" w:cs="Times New Roman"/>
-          <w:sz w:val="24"/>
-          <w:szCs w:val="24"/>
-        </w:rPr>
-        <w:t>]</w:t>
+        <w:t>[18]</w:t>
       </w:r>
       <w:r>
         <w:rPr>
@@ -2696,14 +3156,34 @@
         </w:rPr>
         <w:tab/>
       </w:r>
-      <w:r>
-        <w:rPr>
-          <w:rFonts w:ascii="Times New Roman" w:eastAsia="Times New Roman" w:hAnsi="Times New Roman" w:cs="Times New Roman"/>
-          <w:sz w:val="24"/>
-          <w:szCs w:val="24"/>
-        </w:rPr>
-        <w:t>Vercel Documentation</w:t>
-      </w:r>
+      <w:proofErr w:type="spellStart"/>
+      <w:r>
+        <w:rPr>
+          <w:rFonts w:ascii="Times New Roman" w:eastAsia="Times New Roman" w:hAnsi="Times New Roman" w:cs="Times New Roman"/>
+          <w:sz w:val="24"/>
+          <w:szCs w:val="24"/>
+        </w:rPr>
+        <w:t>Vercel</w:t>
+      </w:r>
+      <w:proofErr w:type="spellEnd"/>
+      <w:r>
+        <w:rPr>
+          <w:rFonts w:ascii="Times New Roman" w:eastAsia="Times New Roman" w:hAnsi="Times New Roman" w:cs="Times New Roman"/>
+          <w:sz w:val="24"/>
+          <w:szCs w:val="24"/>
+        </w:rPr>
+        <w:t xml:space="preserve"> </w:t>
+      </w:r>
+      <w:proofErr w:type="spellStart"/>
+      <w:r>
+        <w:rPr>
+          <w:rFonts w:ascii="Times New Roman" w:eastAsia="Times New Roman" w:hAnsi="Times New Roman" w:cs="Times New Roman"/>
+          <w:sz w:val="24"/>
+          <w:szCs w:val="24"/>
+        </w:rPr>
+        <w:t>Documentation</w:t>
+      </w:r>
+      <w:proofErr w:type="spellEnd"/>
     </w:p>
     <w:p>
       <w:pPr>
@@ -2715,13 +3195,23 @@
           <w:szCs w:val="24"/>
         </w:rPr>
       </w:pPr>
-      <w:r>
-        <w:rPr>
-          <w:rFonts w:ascii="Times New Roman" w:eastAsia="Times New Roman" w:hAnsi="Times New Roman" w:cs="Times New Roman"/>
-          <w:sz w:val="24"/>
-          <w:szCs w:val="24"/>
-        </w:rPr>
-        <w:t>Vercel Inc.</w:t>
+      <w:proofErr w:type="spellStart"/>
+      <w:r>
+        <w:rPr>
+          <w:rFonts w:ascii="Times New Roman" w:eastAsia="Times New Roman" w:hAnsi="Times New Roman" w:cs="Times New Roman"/>
+          <w:sz w:val="24"/>
+          <w:szCs w:val="24"/>
+        </w:rPr>
+        <w:t>Vercel</w:t>
+      </w:r>
+      <w:proofErr w:type="spellEnd"/>
+      <w:r>
+        <w:rPr>
+          <w:rFonts w:ascii="Times New Roman" w:eastAsia="Times New Roman" w:hAnsi="Times New Roman" w:cs="Times New Roman"/>
+          <w:sz w:val="24"/>
+          <w:szCs w:val="24"/>
+        </w:rPr>
+        <w:t xml:space="preserve"> Inc.</w:t>
       </w:r>
       <w:r>
         <w:rPr>
@@ -2783,7 +3273,25 @@
           <w:sz w:val="24"/>
           <w:szCs w:val="24"/>
         </w:rPr>
-        <w:t>: Mayo de 2026</w:t>
+        <w:t xml:space="preserve">: </w:t>
+      </w:r>
+      <w:proofErr w:type="gramStart"/>
+      <w:r>
+        <w:rPr>
+          <w:rFonts w:ascii="Times New Roman" w:eastAsia="Times New Roman" w:hAnsi="Times New Roman" w:cs="Times New Roman"/>
+          <w:sz w:val="24"/>
+          <w:szCs w:val="24"/>
+        </w:rPr>
+        <w:t>Mayo</w:t>
+      </w:r>
+      <w:proofErr w:type="gramEnd"/>
+      <w:r>
+        <w:rPr>
+          <w:rFonts w:ascii="Times New Roman" w:eastAsia="Times New Roman" w:hAnsi="Times New Roman" w:cs="Times New Roman"/>
+          <w:sz w:val="24"/>
+          <w:szCs w:val="24"/>
+        </w:rPr>
+        <w:t xml:space="preserve"> de 2026</w:t>
       </w:r>
     </w:p>
     <w:p>
@@ -2818,23 +3326,7 @@
           <w:sz w:val="24"/>
           <w:szCs w:val="24"/>
         </w:rPr>
-        <w:t>[</w:t>
-      </w:r>
-      <w:r>
-        <w:rPr>
-          <w:rFonts w:ascii="Times New Roman" w:eastAsia="Times New Roman" w:hAnsi="Times New Roman" w:cs="Times New Roman"/>
-          <w:sz w:val="24"/>
-          <w:szCs w:val="24"/>
-        </w:rPr>
-        <w:t>19</w:t>
-      </w:r>
-      <w:r>
-        <w:rPr>
-          <w:rFonts w:ascii="Times New Roman" w:eastAsia="Times New Roman" w:hAnsi="Times New Roman" w:cs="Times New Roman"/>
-          <w:sz w:val="24"/>
-          <w:szCs w:val="24"/>
-        </w:rPr>
-        <w:t>]</w:t>
+        <w:t>[19]</w:t>
       </w:r>
       <w:r>
         <w:rPr>
@@ -2844,14 +3336,34 @@
         </w:rPr>
         <w:tab/>
       </w:r>
-      <w:r>
-        <w:rPr>
-          <w:rFonts w:ascii="Times New Roman" w:eastAsia="Times New Roman" w:hAnsi="Times New Roman" w:cs="Times New Roman"/>
-          <w:sz w:val="24"/>
-          <w:szCs w:val="24"/>
-        </w:rPr>
-        <w:t>Railway Documentation</w:t>
-      </w:r>
+      <w:proofErr w:type="spellStart"/>
+      <w:r>
+        <w:rPr>
+          <w:rFonts w:ascii="Times New Roman" w:eastAsia="Times New Roman" w:hAnsi="Times New Roman" w:cs="Times New Roman"/>
+          <w:sz w:val="24"/>
+          <w:szCs w:val="24"/>
+        </w:rPr>
+        <w:t>Railway</w:t>
+      </w:r>
+      <w:proofErr w:type="spellEnd"/>
+      <w:r>
+        <w:rPr>
+          <w:rFonts w:ascii="Times New Roman" w:eastAsia="Times New Roman" w:hAnsi="Times New Roman" w:cs="Times New Roman"/>
+          <w:sz w:val="24"/>
+          <w:szCs w:val="24"/>
+        </w:rPr>
+        <w:t xml:space="preserve"> </w:t>
+      </w:r>
+      <w:proofErr w:type="spellStart"/>
+      <w:r>
+        <w:rPr>
+          <w:rFonts w:ascii="Times New Roman" w:eastAsia="Times New Roman" w:hAnsi="Times New Roman" w:cs="Times New Roman"/>
+          <w:sz w:val="24"/>
+          <w:szCs w:val="24"/>
+        </w:rPr>
+        <w:t>Documentation</w:t>
+      </w:r>
+      <w:proofErr w:type="spellEnd"/>
     </w:p>
     <w:p>
       <w:pPr>
@@ -2863,13 +3375,23 @@
           <w:szCs w:val="24"/>
         </w:rPr>
       </w:pPr>
-      <w:r>
-        <w:rPr>
-          <w:rFonts w:ascii="Times New Roman" w:eastAsia="Times New Roman" w:hAnsi="Times New Roman" w:cs="Times New Roman"/>
-          <w:sz w:val="24"/>
-          <w:szCs w:val="24"/>
-        </w:rPr>
-        <w:t>Railway Corp.</w:t>
+      <w:proofErr w:type="spellStart"/>
+      <w:r>
+        <w:rPr>
+          <w:rFonts w:ascii="Times New Roman" w:eastAsia="Times New Roman" w:hAnsi="Times New Roman" w:cs="Times New Roman"/>
+          <w:sz w:val="24"/>
+          <w:szCs w:val="24"/>
+        </w:rPr>
+        <w:t>Railway</w:t>
+      </w:r>
+      <w:proofErr w:type="spellEnd"/>
+      <w:r>
+        <w:rPr>
+          <w:rFonts w:ascii="Times New Roman" w:eastAsia="Times New Roman" w:hAnsi="Times New Roman" w:cs="Times New Roman"/>
+          <w:sz w:val="24"/>
+          <w:szCs w:val="24"/>
+        </w:rPr>
+        <w:t xml:space="preserve"> Corp.</w:t>
       </w:r>
       <w:r>
         <w:rPr>
@@ -2931,7 +3453,25 @@
           <w:sz w:val="24"/>
           <w:szCs w:val="24"/>
         </w:rPr>
-        <w:t>: Mayo de 2026</w:t>
+        <w:t xml:space="preserve">: </w:t>
+      </w:r>
+      <w:proofErr w:type="gramStart"/>
+      <w:r>
+        <w:rPr>
+          <w:rFonts w:ascii="Times New Roman" w:eastAsia="Times New Roman" w:hAnsi="Times New Roman" w:cs="Times New Roman"/>
+          <w:sz w:val="24"/>
+          <w:szCs w:val="24"/>
+        </w:rPr>
+        <w:t>Mayo</w:t>
+      </w:r>
+      <w:proofErr w:type="gramEnd"/>
+      <w:r>
+        <w:rPr>
+          <w:rFonts w:ascii="Times New Roman" w:eastAsia="Times New Roman" w:hAnsi="Times New Roman" w:cs="Times New Roman"/>
+          <w:sz w:val="24"/>
+          <w:szCs w:val="24"/>
+        </w:rPr>
+        <w:t xml:space="preserve"> de 2026</w:t>
       </w:r>
     </w:p>
     <w:p>
@@ -2967,23 +3507,7 @@
           <w:sz w:val="24"/>
           <w:szCs w:val="24"/>
         </w:rPr>
-        <w:t>[</w:t>
-      </w:r>
-      <w:r>
-        <w:rPr>
-          <w:rFonts w:ascii="Times New Roman" w:eastAsia="Times New Roman" w:hAnsi="Times New Roman" w:cs="Times New Roman"/>
-          <w:sz w:val="24"/>
-          <w:szCs w:val="24"/>
-        </w:rPr>
-        <w:t>20</w:t>
-      </w:r>
-      <w:r>
-        <w:rPr>
-          <w:rFonts w:ascii="Times New Roman" w:eastAsia="Times New Roman" w:hAnsi="Times New Roman" w:cs="Times New Roman"/>
-          <w:sz w:val="24"/>
-          <w:szCs w:val="24"/>
-        </w:rPr>
-        <w:t>]</w:t>
+        <w:t>[20]</w:t>
       </w:r>
       <w:r>
         <w:rPr>
@@ -3080,7 +3604,188 @@
           <w:sz w:val="24"/>
           <w:szCs w:val="24"/>
         </w:rPr>
-        <w:t>: Mayo de 2026</w:t>
+        <w:t xml:space="preserve">: </w:t>
+      </w:r>
+      <w:proofErr w:type="gramStart"/>
+      <w:r>
+        <w:rPr>
+          <w:rFonts w:ascii="Times New Roman" w:eastAsia="Times New Roman" w:hAnsi="Times New Roman" w:cs="Times New Roman"/>
+          <w:sz w:val="24"/>
+          <w:szCs w:val="24"/>
+        </w:rPr>
+        <w:t>Mayo</w:t>
+      </w:r>
+      <w:proofErr w:type="gramEnd"/>
+      <w:r>
+        <w:rPr>
+          <w:rFonts w:ascii="Times New Roman" w:eastAsia="Times New Roman" w:hAnsi="Times New Roman" w:cs="Times New Roman"/>
+          <w:sz w:val="24"/>
+          <w:szCs w:val="24"/>
+        </w:rPr>
+        <w:t xml:space="preserve"> de 2026</w:t>
+      </w:r>
+    </w:p>
+    <w:p>
+      <w:pPr>
+        <w:pBdr>
+          <w:top w:val="nil"/>
+          <w:left w:val="nil"/>
+          <w:bottom w:val="nil"/>
+          <w:right w:val="nil"/>
+          <w:between w:val="nil"/>
+        </w:pBdr>
+        <w:jc w:val="both"/>
+        <w:rPr>
+          <w:rFonts w:ascii="Times New Roman" w:eastAsia="Times New Roman" w:hAnsi="Times New Roman" w:cs="Times New Roman"/>
+          <w:sz w:val="24"/>
+          <w:szCs w:val="24"/>
+        </w:rPr>
+      </w:pPr>
+    </w:p>
+    <w:p>
+      <w:pPr>
+        <w:ind w:left="720" w:hanging="720"/>
+        <w:jc w:val="both"/>
+        <w:rPr>
+          <w:rFonts w:ascii="Times New Roman" w:eastAsia="Times New Roman" w:hAnsi="Times New Roman" w:cs="Times New Roman"/>
+          <w:sz w:val="24"/>
+          <w:szCs w:val="24"/>
+        </w:rPr>
+      </w:pPr>
+      <w:r>
+        <w:rPr>
+          <w:rFonts w:ascii="Times New Roman" w:eastAsia="Times New Roman" w:hAnsi="Times New Roman" w:cs="Times New Roman"/>
+          <w:sz w:val="24"/>
+          <w:szCs w:val="24"/>
+        </w:rPr>
+        <w:t>[21]</w:t>
+      </w:r>
+      <w:r>
+        <w:rPr>
+          <w:rFonts w:ascii="Times New Roman" w:eastAsia="Times New Roman" w:hAnsi="Times New Roman" w:cs="Times New Roman"/>
+          <w:sz w:val="24"/>
+          <w:szCs w:val="24"/>
+        </w:rPr>
+        <w:tab/>
+      </w:r>
+      <w:r>
+        <w:rPr>
+          <w:rFonts w:ascii="Times New Roman" w:eastAsia="Times New Roman" w:hAnsi="Times New Roman" w:cs="Times New Roman"/>
+          <w:sz w:val="24"/>
+          <w:szCs w:val="24"/>
+        </w:rPr>
+        <w:t xml:space="preserve">The </w:t>
+      </w:r>
+      <w:proofErr w:type="spellStart"/>
+      <w:r>
+        <w:rPr>
+          <w:rFonts w:ascii="Times New Roman" w:eastAsia="Times New Roman" w:hAnsi="Times New Roman" w:cs="Times New Roman"/>
+          <w:sz w:val="24"/>
+          <w:szCs w:val="24"/>
+        </w:rPr>
+        <w:t>WebSocket</w:t>
+      </w:r>
+      <w:proofErr w:type="spellEnd"/>
+      <w:r>
+        <w:rPr>
+          <w:rFonts w:ascii="Times New Roman" w:eastAsia="Times New Roman" w:hAnsi="Times New Roman" w:cs="Times New Roman"/>
+          <w:sz w:val="24"/>
+          <w:szCs w:val="24"/>
+        </w:rPr>
+        <w:t xml:space="preserve"> </w:t>
+      </w:r>
+      <w:proofErr w:type="spellStart"/>
+      <w:r>
+        <w:rPr>
+          <w:rFonts w:ascii="Times New Roman" w:eastAsia="Times New Roman" w:hAnsi="Times New Roman" w:cs="Times New Roman"/>
+          <w:sz w:val="24"/>
+          <w:szCs w:val="24"/>
+        </w:rPr>
+        <w:t>Protocol</w:t>
+      </w:r>
+      <w:proofErr w:type="spellEnd"/>
+      <w:r>
+        <w:rPr>
+          <w:rFonts w:ascii="Times New Roman" w:eastAsia="Times New Roman" w:hAnsi="Times New Roman" w:cs="Times New Roman"/>
+          <w:sz w:val="24"/>
+          <w:szCs w:val="24"/>
+        </w:rPr>
+        <w:t xml:space="preserve"> — RFC 6455</w:t>
+      </w:r>
+    </w:p>
+    <w:p>
+      <w:pPr>
+        <w:ind w:firstLine="720"/>
+        <w:jc w:val="both"/>
+        <w:rPr>
+          <w:rFonts w:ascii="Times New Roman" w:eastAsia="Times New Roman" w:hAnsi="Times New Roman" w:cs="Times New Roman"/>
+          <w:sz w:val="24"/>
+          <w:szCs w:val="24"/>
+        </w:rPr>
+      </w:pPr>
+      <w:r>
+        <w:rPr>
+          <w:rFonts w:ascii="Times New Roman" w:eastAsia="Times New Roman" w:hAnsi="Times New Roman" w:cs="Times New Roman"/>
+          <w:sz w:val="24"/>
+          <w:szCs w:val="24"/>
+        </w:rPr>
+        <w:t>I. Fette, A. Melnikov</w:t>
+      </w:r>
+      <w:r>
+        <w:rPr>
+          <w:rFonts w:ascii="Times New Roman" w:eastAsia="Times New Roman" w:hAnsi="Times New Roman" w:cs="Times New Roman"/>
+          <w:sz w:val="24"/>
+          <w:szCs w:val="24"/>
+        </w:rPr>
+        <w:t xml:space="preserve"> / </w:t>
+      </w:r>
+      <w:hyperlink r:id="rId24" w:history="1">
+        <w:r>
+          <w:rPr>
+            <w:rStyle w:val="Hipervnculo"/>
+          </w:rPr>
+          <w:t>https://datatracker.ietf.org/doc/html/rfc6455</w:t>
+        </w:r>
+      </w:hyperlink>
+      <w:r>
+        <w:t xml:space="preserve"> </w:t>
+      </w:r>
+    </w:p>
+    <w:p>
+      <w:pPr>
+        <w:ind w:firstLine="720"/>
+        <w:jc w:val="both"/>
+        <w:rPr>
+          <w:rFonts w:ascii="Times New Roman" w:eastAsia="Times New Roman" w:hAnsi="Times New Roman" w:cs="Times New Roman"/>
+          <w:sz w:val="24"/>
+          <w:szCs w:val="24"/>
+        </w:rPr>
+      </w:pPr>
+      <w:r>
+        <w:rPr>
+          <w:rFonts w:ascii="Times New Roman" w:eastAsia="Times New Roman" w:hAnsi="Times New Roman" w:cs="Times New Roman"/>
+          <w:sz w:val="24"/>
+          <w:szCs w:val="24"/>
+        </w:rPr>
+        <w:t xml:space="preserve">Fecha de consulta: </w:t>
+      </w:r>
+      <w:proofErr w:type="gramStart"/>
+      <w:r>
+        <w:rPr>
+          <w:rFonts w:ascii="Times New Roman" w:eastAsia="Times New Roman" w:hAnsi="Times New Roman" w:cs="Times New Roman"/>
+          <w:sz w:val="24"/>
+          <w:szCs w:val="24"/>
+        </w:rPr>
+        <w:t>Marzo</w:t>
+      </w:r>
+      <w:proofErr w:type="gramEnd"/>
+      <w:r>
+        <w:rPr>
+          <w:rFonts w:ascii="Times New Roman" w:eastAsia="Times New Roman" w:hAnsi="Times New Roman" w:cs="Times New Roman"/>
+          <w:sz w:val="24"/>
+          <w:szCs w:val="24"/>
+        </w:rPr>
+        <w:t xml:space="preserve"> de 2026</w:t>
       </w:r>
     </w:p>
     <w:p>
@@ -3632,6 +4337,7 @@
   <w:style w:type="character" w:default="1" w:styleId="Fuentedeprrafopredeter">
     <w:name w:val="Default Paragraph Font"/>
     <w:uiPriority w:val="1"/>
+    <w:semiHidden/>
     <w:unhideWhenUsed/>
   </w:style>
   <w:style w:type="table" w:default="1" w:styleId="Tablanormal">

</xml_diff>